<commit_message>
Design Class Diagram initial commit
</commit_message>
<xml_diff>
--- a/class diagram draft.docx
+++ b/class diagram draft.docx
@@ -711,11 +711,9 @@
           <w:numId w:val="1"/>
         </w:numPr>
       </w:pPr>
-      <w:proofErr w:type="gramStart"/>
       <w:r>
         <w:t>Sale</w:t>
       </w:r>
-      <w:proofErr w:type="gramEnd"/>
     </w:p>
     <w:p>
       <w:pPr>
@@ -750,45 +748,6 @@
         </w:numPr>
       </w:pPr>
       <w:r>
-        <w:t>subto</w:t>
-      </w:r>
-      <w:r>
-        <w:t>tal: double</w:t>
-      </w:r>
-    </w:p>
-    <w:p>
-      <w:pPr>
-        <w:pStyle w:val="ListParagraph"/>
-        <w:numPr>
-          <w:ilvl w:val="1"/>
-          <w:numId w:val="1"/>
-        </w:numPr>
-      </w:pPr>
-      <w:r>
-        <w:t>discountTotal: double</w:t>
-      </w:r>
-    </w:p>
-    <w:p>
-      <w:pPr>
-        <w:pStyle w:val="ListParagraph"/>
-        <w:numPr>
-          <w:ilvl w:val="1"/>
-          <w:numId w:val="1"/>
-        </w:numPr>
-      </w:pPr>
-      <w:r>
-        <w:t>taxTotal: double</w:t>
-      </w:r>
-    </w:p>
-    <w:p>
-      <w:pPr>
-        <w:pStyle w:val="ListParagraph"/>
-        <w:numPr>
-          <w:ilvl w:val="1"/>
-          <w:numId w:val="1"/>
-        </w:numPr>
-      </w:pPr>
-      <w:r>
         <w:t>finalAmount: double</w:t>
       </w:r>
     </w:p>
@@ -850,18 +809,6 @@
       </w:pPr>
       <w:r>
         <w:t>tax: double</w:t>
-      </w:r>
-    </w:p>
-    <w:p>
-      <w:pPr>
-        <w:pStyle w:val="ListParagraph"/>
-        <w:numPr>
-          <w:ilvl w:val="1"/>
-          <w:numId w:val="1"/>
-        </w:numPr>
-      </w:pPr>
-      <w:r>
-        <w:t>lineTotal: double</w:t>
       </w:r>
     </w:p>
     <w:p>
@@ -963,11 +910,9 @@
           <w:numId w:val="1"/>
         </w:numPr>
       </w:pPr>
-      <w:proofErr w:type="gramStart"/>
       <w:r>
         <w:t>CustomerRequest</w:t>
       </w:r>
-      <w:proofErr w:type="gramEnd"/>
     </w:p>
     <w:p>
       <w:pPr>
@@ -1014,8 +959,497 @@
         </w:numPr>
       </w:pPr>
       <w:r>
+        <w:t>requestDate: Date</w:t>
+      </w:r>
+    </w:p>
+    <w:p>
+      <w:pPr>
+        <w:rPr>
+          <w:b/>
+          <w:bCs/>
+          <w:sz w:val="28"/>
+          <w:szCs w:val="28"/>
+        </w:rPr>
+      </w:pPr>
+      <w:r>
+        <w:rPr>
+          <w:b/>
+          <w:bCs/>
+          <w:sz w:val="28"/>
+          <w:szCs w:val="28"/>
+        </w:rPr>
+        <w:t>Classes &amp; Attributes</w:t>
+      </w:r>
+    </w:p>
+    <w:p>
+      <w:pPr>
+        <w:rPr>
+          <w:b/>
+          <w:bCs/>
+        </w:rPr>
+      </w:pPr>
+      <w:r>
+        <w:rPr>
+          <w:b/>
+          <w:bCs/>
+        </w:rPr>
+        <w:t>Generalizations:</w:t>
+      </w:r>
+    </w:p>
+    <w:p>
+      <w:pPr>
+        <w:pStyle w:val="ListParagraph"/>
+        <w:numPr>
+          <w:ilvl w:val="0"/>
+          <w:numId w:val="1"/>
+        </w:numPr>
+        <w:rPr>
+          <w:b/>
+          <w:bCs/>
+        </w:rPr>
+      </w:pPr>
+      <w:r>
         <w:lastRenderedPageBreak/>
-        <w:t>requestDate: Date</w:t>
+        <w:t>Administrator, InventoryManager, StoreManager, Salesperson</w:t>
+      </w:r>
+      <w:r>
+        <w:t xml:space="preserve"> extends </w:t>
+      </w:r>
+      <w:r>
+        <w:rPr>
+          <w:b/>
+          <w:bCs/>
+        </w:rPr>
+        <w:t>Employee</w:t>
+      </w:r>
+    </w:p>
+    <w:p>
+      <w:pPr>
+        <w:pStyle w:val="ListParagraph"/>
+        <w:numPr>
+          <w:ilvl w:val="0"/>
+          <w:numId w:val="1"/>
+        </w:numPr>
+        <w:rPr>
+          <w:b/>
+          <w:bCs/>
+        </w:rPr>
+      </w:pPr>
+      <w:r>
+        <w:t>ExpirableItem extends</w:t>
+      </w:r>
+      <w:r>
+        <w:rPr>
+          <w:b/>
+          <w:bCs/>
+        </w:rPr>
+        <w:t xml:space="preserve"> Item</w:t>
+      </w:r>
+    </w:p>
+    <w:p>
+      <w:pPr>
+        <w:rPr>
+          <w:b/>
+          <w:bCs/>
+        </w:rPr>
+      </w:pPr>
+      <w:r>
+        <w:rPr>
+          <w:b/>
+          <w:bCs/>
+        </w:rPr>
+        <w:t>Composition/Aggregations:</w:t>
+      </w:r>
+    </w:p>
+    <w:p>
+      <w:pPr>
+        <w:pStyle w:val="ListParagraph"/>
+        <w:numPr>
+          <w:ilvl w:val="0"/>
+          <w:numId w:val="1"/>
+        </w:numPr>
+      </w:pPr>
+      <w:r>
+        <w:t>I</w:t>
+      </w:r>
+      <w:r>
+        <w:t>n</w:t>
+      </w:r>
+      <w:r>
+        <w:t xml:space="preserve">ventory </w:t>
+      </w:r>
+      <w:r>
+        <w:rPr>
+          <w:rFonts w:ascii="Cambria Math" w:hAnsi="Cambria Math" w:cs="Cambria Math"/>
+        </w:rPr>
+        <w:t>◇</w:t>
+      </w:r>
+      <w:r>
+        <w:rPr>
+          <w:rFonts w:ascii="Cambria Math" w:hAnsi="Cambria Math" w:cs="Cambria Math"/>
+        </w:rPr>
+        <w:t>-</w:t>
+      </w:r>
+      <w:r>
+        <w:t xml:space="preserve"> I</w:t>
+      </w:r>
+      <w:r>
+        <w:t>tem (</w:t>
+      </w:r>
+      <w:r>
+        <w:t>1 -&gt; 0..*)</w:t>
+      </w:r>
+    </w:p>
+    <w:p>
+      <w:pPr>
+        <w:pStyle w:val="ListParagraph"/>
+        <w:numPr>
+          <w:ilvl w:val="0"/>
+          <w:numId w:val="1"/>
+        </w:numPr>
+      </w:pPr>
+      <w:r>
+        <w:t>Inventory</w:t>
+      </w:r>
+      <w:r>
+        <w:t xml:space="preserve"> </w:t>
+      </w:r>
+      <w:r>
+        <w:rPr>
+          <w:rFonts w:ascii="Cambria Math" w:hAnsi="Cambria Math" w:cs="Cambria Math"/>
+        </w:rPr>
+        <w:t>◆</w:t>
+      </w:r>
+      <w:r>
+        <w:t xml:space="preserve">- StockMovement (1 -&gt; </w:t>
+      </w:r>
+      <w:r>
+        <w:t>0...*)</w:t>
+      </w:r>
+    </w:p>
+    <w:p>
+      <w:pPr>
+        <w:pStyle w:val="ListParagraph"/>
+        <w:numPr>
+          <w:ilvl w:val="0"/>
+          <w:numId w:val="1"/>
+        </w:numPr>
+      </w:pPr>
+      <w:r>
+        <w:t xml:space="preserve">SupplierOrder </w:t>
+      </w:r>
+      <w:r>
+        <w:rPr>
+          <w:rFonts w:ascii="Cambria Math" w:hAnsi="Cambria Math" w:cs="Cambria Math"/>
+        </w:rPr>
+        <w:t>◆</w:t>
+      </w:r>
+      <w:r>
+        <w:t>-OrderLine</w:t>
+      </w:r>
+      <w:r>
+        <w:t xml:space="preserve"> (1 -&gt; 1..*)</w:t>
+      </w:r>
+    </w:p>
+    <w:p>
+      <w:pPr>
+        <w:pStyle w:val="ListParagraph"/>
+        <w:numPr>
+          <w:ilvl w:val="0"/>
+          <w:numId w:val="1"/>
+        </w:numPr>
+      </w:pPr>
+      <w:r>
+        <w:t xml:space="preserve">Sale </w:t>
+      </w:r>
+      <w:r>
+        <w:rPr>
+          <w:rFonts w:ascii="Cambria Math" w:hAnsi="Cambria Math" w:cs="Cambria Math"/>
+        </w:rPr>
+        <w:t>◆</w:t>
+      </w:r>
+      <w:r>
+        <w:t>- SaleLineItem (1 -&gt; 1</w:t>
+      </w:r>
+      <w:r>
+        <w:t>…</w:t>
+      </w:r>
+      <w:r>
+        <w:t>*</w:t>
+      </w:r>
+      <w:r>
+        <w:t>)</w:t>
+      </w:r>
+    </w:p>
+    <w:p>
+      <w:pPr>
+        <w:rPr>
+          <w:b/>
+          <w:bCs/>
+        </w:rPr>
+      </w:pPr>
+      <w:r>
+        <w:rPr>
+          <w:b/>
+          <w:bCs/>
+        </w:rPr>
+        <w:t>Associations</w:t>
+      </w:r>
+      <w:r>
+        <w:rPr>
+          <w:b/>
+          <w:bCs/>
+        </w:rPr>
+        <w:t>:</w:t>
+      </w:r>
+    </w:p>
+    <w:p>
+      <w:pPr>
+        <w:pStyle w:val="ListParagraph"/>
+        <w:numPr>
+          <w:ilvl w:val="0"/>
+          <w:numId w:val="1"/>
+        </w:numPr>
+      </w:pPr>
+      <w:r>
+        <w:t xml:space="preserve">StockMovment </w:t>
+      </w:r>
+      <w:r>
+        <w:t>–</w:t>
+      </w:r>
+      <w:r>
+        <w:t xml:space="preserve"> Item</w:t>
+      </w:r>
+      <w:r>
+        <w:t xml:space="preserve"> (</w:t>
+      </w:r>
+      <w:r>
+        <w:t>uses</w:t>
+      </w:r>
+      <w:r>
+        <w:t>) 0…* to 1</w:t>
+      </w:r>
+    </w:p>
+    <w:p>
+      <w:pPr>
+        <w:pStyle w:val="ListParagraph"/>
+        <w:numPr>
+          <w:ilvl w:val="0"/>
+          <w:numId w:val="1"/>
+        </w:numPr>
+      </w:pPr>
+      <w:r>
+        <w:t>OrderLine – Item (order</w:t>
+      </w:r>
+      <w:r>
+        <w:t>s</w:t>
+      </w:r>
+      <w:r>
+        <w:t>)</w:t>
+      </w:r>
+      <w:r>
+        <w:t xml:space="preserve"> 0...* to 1</w:t>
+      </w:r>
+    </w:p>
+    <w:p>
+      <w:pPr>
+        <w:pStyle w:val="ListParagraph"/>
+        <w:numPr>
+          <w:ilvl w:val="0"/>
+          <w:numId w:val="1"/>
+        </w:numPr>
+      </w:pPr>
+      <w:r>
+        <w:t>SaleLineItem – Item (sells) 0…* to 1</w:t>
+      </w:r>
+    </w:p>
+    <w:p>
+      <w:pPr>
+        <w:pStyle w:val="ListParagraph"/>
+        <w:numPr>
+          <w:ilvl w:val="0"/>
+          <w:numId w:val="1"/>
+        </w:numPr>
+      </w:pPr>
+      <w:r>
+        <w:t>SupplierOrder – Supplier (placed with) 0..* to 1</w:t>
+      </w:r>
+    </w:p>
+    <w:p>
+      <w:pPr>
+        <w:pStyle w:val="ListParagraph"/>
+        <w:numPr>
+          <w:ilvl w:val="0"/>
+          <w:numId w:val="1"/>
+        </w:numPr>
+      </w:pPr>
+      <w:r>
+        <w:t>SupplierOrder – Invoice (bills) 1 to 0..1</w:t>
+      </w:r>
+    </w:p>
+    <w:p>
+      <w:pPr>
+        <w:pStyle w:val="ListParagraph"/>
+        <w:numPr>
+          <w:ilvl w:val="0"/>
+          <w:numId w:val="1"/>
+        </w:numPr>
+      </w:pPr>
+      <w:r>
+        <w:t xml:space="preserve">SupplierOrder </w:t>
+      </w:r>
+      <w:r>
+        <w:t>–</w:t>
+      </w:r>
+      <w:r>
+        <w:t xml:space="preserve"> InventoryManager</w:t>
+      </w:r>
+      <w:r>
+        <w:t xml:space="preserve"> (prepares) 0..* to 1</w:t>
+      </w:r>
+    </w:p>
+    <w:p>
+      <w:pPr>
+        <w:pStyle w:val="ListParagraph"/>
+        <w:numPr>
+          <w:ilvl w:val="0"/>
+          <w:numId w:val="1"/>
+        </w:numPr>
+      </w:pPr>
+      <w:r>
+        <w:t xml:space="preserve">SupplierOrder – StoreManager (verifies) 0..* to </w:t>
+      </w:r>
+      <w:r>
+        <w:t>0..1</w:t>
+      </w:r>
+    </w:p>
+    <w:p>
+      <w:pPr>
+        <w:pStyle w:val="ListParagraph"/>
+        <w:numPr>
+          <w:ilvl w:val="0"/>
+          <w:numId w:val="1"/>
+        </w:numPr>
+      </w:pPr>
+      <w:r>
+        <w:t xml:space="preserve">Sale – Salesperson </w:t>
+      </w:r>
+      <w:r>
+        <w:t>(processes) 0..* to 1</w:t>
+      </w:r>
+    </w:p>
+    <w:p>
+      <w:pPr>
+        <w:pStyle w:val="ListParagraph"/>
+        <w:numPr>
+          <w:ilvl w:val="0"/>
+          <w:numId w:val="1"/>
+        </w:numPr>
+      </w:pPr>
+      <w:r>
+        <w:t>Sale – CancelledReceipt (cancel</w:t>
+      </w:r>
+      <w:r>
+        <w:t>s)</w:t>
+      </w:r>
+      <w:r>
+        <w:t xml:space="preserve"> 1 to 0..1</w:t>
+      </w:r>
+    </w:p>
+    <w:p>
+      <w:pPr>
+        <w:pStyle w:val="ListParagraph"/>
+        <w:numPr>
+          <w:ilvl w:val="0"/>
+          <w:numId w:val="1"/>
+        </w:numPr>
+      </w:pPr>
+      <w:r>
+        <w:t>Sale – Replacement (replaces</w:t>
+      </w:r>
+      <w:r>
+        <w:t xml:space="preserve"> from</w:t>
+      </w:r>
+      <w:r>
+        <w:t>)</w:t>
+      </w:r>
+      <w:r>
+        <w:t xml:space="preserve"> 1 to 0..*</w:t>
+      </w:r>
+    </w:p>
+    <w:p>
+      <w:pPr>
+        <w:pStyle w:val="ListParagraph"/>
+        <w:numPr>
+          <w:ilvl w:val="0"/>
+          <w:numId w:val="1"/>
+        </w:numPr>
+      </w:pPr>
+      <w:r>
+        <w:t>Re</w:t>
+      </w:r>
+      <w:r>
+        <w:t>placement – Item (replaces) 0..* to 1</w:t>
+      </w:r>
+    </w:p>
+    <w:p>
+      <w:pPr>
+        <w:rPr>
+          <w:b/>
+          <w:bCs/>
+        </w:rPr>
+      </w:pPr>
+      <w:r>
+        <w:rPr>
+          <w:b/>
+          <w:bCs/>
+        </w:rPr>
+        <w:t>Controller:</w:t>
+      </w:r>
+    </w:p>
+    <w:p>
+      <w:pPr>
+        <w:pStyle w:val="ListParagraph"/>
+        <w:numPr>
+          <w:ilvl w:val="0"/>
+          <w:numId w:val="1"/>
+        </w:numPr>
+      </w:pPr>
+      <w:r>
+        <w:t xml:space="preserve">PearlMartSystem – Inventory </w:t>
+      </w:r>
+      <w:r>
+        <w:t>(1 to 1)</w:t>
+      </w:r>
+    </w:p>
+    <w:p>
+      <w:pPr>
+        <w:pStyle w:val="ListParagraph"/>
+        <w:numPr>
+          <w:ilvl w:val="0"/>
+          <w:numId w:val="1"/>
+        </w:numPr>
+      </w:pPr>
+      <w:r>
+        <w:t>PearlMartSystem</w:t>
+      </w:r>
+      <w:r>
+        <w:t xml:space="preserve"> – Employee, Supplier, SupplierOrder, Sale, CustomerRequest (1 to 0..*)</w:t>
+      </w:r>
+    </w:p>
+    <w:p>
+      <w:pPr>
+        <w:pStyle w:val="ListParagraph"/>
+        <w:numPr>
+          <w:ilvl w:val="0"/>
+          <w:numId w:val="1"/>
+        </w:numPr>
+      </w:pPr>
+      <w:r>
+        <w:t>PearlMartSystem</w:t>
+      </w:r>
+      <w:r>
+        <w:t xml:space="preserve"> to SupplierGateway</w:t>
       </w:r>
     </w:p>
     <w:sectPr>
@@ -1751,7 +2185,6 @@
   <w:style w:type="character" w:default="1" w:styleId="DefaultParagraphFont">
     <w:name w:val="Default Paragraph Font"/>
     <w:uiPriority w:val="1"/>
-    <w:semiHidden/>
     <w:unhideWhenUsed/>
   </w:style>
   <w:style w:type="table" w:default="1" w:styleId="TableNormal">

</xml_diff>

<commit_message>
Design class diagram without methods
</commit_message>
<xml_diff>
--- a/class diagram draft.docx
+++ b/class diagram draft.docx
@@ -978,7 +978,7 @@
           <w:sz w:val="28"/>
           <w:szCs w:val="28"/>
         </w:rPr>
-        <w:t>Classes &amp; Attributes</w:t>
+        <w:t>Associations</w:t>
       </w:r>
     </w:p>
     <w:p>
@@ -1224,7 +1224,7 @@
         <w:t xml:space="preserve"> (</w:t>
       </w:r>
       <w:r>
-        <w:t>uses</w:t>
+        <w:t>concerns</w:t>
       </w:r>
       <w:r>
         <w:t>) 0…* to 1</w:t>
@@ -1434,7 +1434,13 @@
         <w:t>PearlMartSystem</w:t>
       </w:r>
       <w:r>
-        <w:t xml:space="preserve"> – Employee, Supplier, SupplierOrder, Sale, CustomerRequest (1 to 0..*)</w:t>
+        <w:t xml:space="preserve"> – Employee, </w:t>
+      </w:r>
+      <w:r>
+        <w:t>Inventory</w:t>
+      </w:r>
+      <w:r>
+        <w:t>, CustomerRequest (1 to 0..*)</w:t>
       </w:r>
     </w:p>
     <w:p>
@@ -1450,6 +1456,37 @@
       </w:r>
       <w:r>
         <w:t xml:space="preserve"> to SupplierGateway</w:t>
+      </w:r>
+    </w:p>
+    <w:p>
+      <w:pPr>
+        <w:rPr>
+          <w:b/>
+          <w:bCs/>
+          <w:sz w:val="28"/>
+          <w:szCs w:val="28"/>
+        </w:rPr>
+      </w:pPr>
+      <w:r>
+        <w:rPr>
+          <w:b/>
+          <w:bCs/>
+          <w:sz w:val="28"/>
+          <w:szCs w:val="28"/>
+        </w:rPr>
+        <w:t>Methods</w:t>
+      </w:r>
+    </w:p>
+    <w:p>
+      <w:pPr>
+        <w:pStyle w:val="ListParagraph"/>
+        <w:numPr>
+          <w:ilvl w:val="0"/>
+          <w:numId w:val="1"/>
+        </w:numPr>
+      </w:pPr>
+      <w:r>
+        <w:t>g</w:t>
       </w:r>
     </w:p>
     <w:sectPr>

</xml_diff>